<commit_message>
chore: Update project report document with latest findings and insights
</commit_message>
<xml_diff>
--- a/bench-out/iTantra-Project-Report.docx
+++ b/bench-out/iTantra-Project-Report.docx
@@ -8444,7 +8444,7 @@
         </w:rPr>
         <w:t xml:space="preserve"> — the multilingual acoustic model, 22 Indian languages</w:t>
       </w:r>
-      <w:hyperlink w:history="1" r:id="rId2qmpzw65n_vlpzundtvgh">
+      <w:hyperlink w:history="1" r:id="rIdvrb5wjvkwjnu9mk78mmbw">
         <w:r>
           <w:rPr>
             <w:rFonts w:ascii="Calibri" w:cs="Calibri" w:eastAsia="Calibri" w:hAnsi="Calibri"/>
@@ -8487,7 +8487,7 @@
         </w:rPr>
         <w:t xml:space="preserve"> — reference implementation and export scripts</w:t>
       </w:r>
-      <w:hyperlink w:history="1" r:id="rIdzn46av2vnwmsywfpyn3de">
+      <w:hyperlink w:history="1" r:id="rIdiq4f7cbiofchnjywqwusn">
         <w:r>
           <w:rPr>
             <w:rFonts w:ascii="Calibri" w:cs="Calibri" w:eastAsia="Calibri" w:hAnsi="Calibri"/>
@@ -8530,7 +8530,7 @@
         </w:rPr>
         <w:t xml:space="preserve"> — index of the released Indic speech and language models</w:t>
       </w:r>
-      <w:hyperlink w:history="1" r:id="rId4c5zz34ladow407iyfhj6">
+      <w:hyperlink w:history="1" r:id="rIddehw3ko7nlltjkjteydub">
         <w:r>
           <w:rPr>
             <w:rFonts w:ascii="Calibri" w:cs="Calibri" w:eastAsia="Calibri" w:hAnsi="Calibri"/>
@@ -8573,7 +8573,7 @@
         </w:rPr>
         <w:t xml:space="preserve"> — the benchmark suite; Kathbath is its ASR component</w:t>
       </w:r>
-      <w:hyperlink w:history="1" r:id="rIdzpyatf-2dsvszc28mv1v0">
+      <w:hyperlink w:history="1" r:id="rId4s1cqbprblymidop7zsbh">
         <w:r>
           <w:rPr>
             <w:rFonts w:ascii="Calibri" w:cs="Calibri" w:eastAsia="Calibri" w:hAnsi="Calibri"/>
@@ -8616,7 +8616,7 @@
         </w:rPr>
         <w:t xml:space="preserve"> — 1,684 hours of labelled speech across 12 Indian languages</w:t>
       </w:r>
-      <w:hyperlink w:history="1" r:id="rIdjghlbt78ltpet-vst2k6m">
+      <w:hyperlink w:history="1" r:id="rIdvvwzlsksfrhdy72kgn5gg">
         <w:r>
           <w:rPr>
             <w:rFonts w:ascii="Calibri" w:cs="Calibri" w:eastAsia="Calibri" w:hAnsi="Calibri"/>
@@ -8659,7 +8659,7 @@
         </w:rPr>
         <w:t xml:space="preserve"> — Javed et al., the methodology behind the benchmark</w:t>
       </w:r>
-      <w:hyperlink w:history="1" r:id="rIdi9lwiceu1lqxu2eziarw3">
+      <w:hyperlink w:history="1" r:id="rId7qx8clsp65aqlyhgqdvgc">
         <w:r>
           <w:rPr>
             <w:rFonts w:ascii="Calibri" w:cs="Calibri" w:eastAsia="Calibri" w:hAnsi="Calibri"/>
@@ -8702,7 +8702,7 @@
         </w:rPr>
         <w:t xml:space="preserve"> — spontaneous rather than read speech — the realistic condition</w:t>
       </w:r>
-      <w:hyperlink w:history="1" r:id="rIdydamim45dhvyjyjogwmpv">
+      <w:hyperlink w:history="1" r:id="rId4v1laccuk67kfplwlvici">
         <w:r>
           <w:rPr>
             <w:rFonts w:ascii="Calibri" w:cs="Calibri" w:eastAsia="Calibri" w:hAnsi="Calibri"/>
@@ -8745,7 +8745,7 @@
         </w:rPr>
         <w:t xml:space="preserve"> — IISc and ARTPARK, funded by Google; district-level accent coverage</w:t>
       </w:r>
-      <w:hyperlink w:history="1" r:id="rIded7be-byqv1jffrqcvatt">
+      <w:hyperlink w:history="1" r:id="rIdq1stbgjqjlbeuaw8_uc8y">
         <w:r>
           <w:rPr>
             <w:rFonts w:ascii="Calibri" w:cs="Calibri" w:eastAsia="Calibri" w:hAnsi="Calibri"/>
@@ -8788,7 +8788,7 @@
         </w:rPr>
         <w:t xml:space="preserve"> — the released portion of the corpus</w:t>
       </w:r>
-      <w:hyperlink w:history="1" r:id="rIdptuvh0yctqag9xtju2fww">
+      <w:hyperlink w:history="1" r:id="rIdv-lvdv18vjowqycun1amo">
         <w:r>
           <w:rPr>
             <w:rFonts w:ascii="Calibri" w:cs="Calibri" w:eastAsia="Calibri" w:hAnsi="Calibri"/>
@@ -8831,7 +8831,7 @@
         </w:rPr>
         <w:t xml:space="preserve"> — Google; makes figures comparable with published literature</w:t>
       </w:r>
-      <w:hyperlink w:history="1" r:id="rIdc_d1650i5qb1ovtv666vg">
+      <w:hyperlink w:history="1" r:id="rId1nz58a18dblmssp1pypqk">
         <w:r>
           <w:rPr>
             <w:rFonts w:ascii="Calibri" w:cs="Calibri" w:eastAsia="Calibri" w:hAnsi="Calibri"/>
@@ -8874,7 +8874,7 @@
         </w:rPr>
         <w:t xml:space="preserve"> — Conneau et al., 2022</w:t>
       </w:r>
-      <w:hyperlink w:history="1" r:id="rIdks5smhw5xnop5s5japusz">
+      <w:hyperlink w:history="1" r:id="rIdr_xf6xj8iq41budv19yxy">
         <w:r>
           <w:rPr>
             <w:rFonts w:ascii="Calibri" w:cs="Calibri" w:eastAsia="Calibri" w:hAnsi="Calibri"/>
@@ -8917,7 +8917,7 @@
         </w:rPr>
         <w:t xml:space="preserve"> — supplementary validation corpus</w:t>
       </w:r>
-      <w:hyperlink w:history="1" r:id="rIdlcmay4ex3mobpysbc1nbh">
+      <w:hyperlink w:history="1" r:id="rIdjal7kvnfd1i7soujftz0n">
         <w:r>
           <w:rPr>
             <w:rFonts w:ascii="Calibri" w:cs="Calibri" w:eastAsia="Calibri" w:hAnsi="Calibri"/>
@@ -8960,7 +8960,7 @@
         </w:rPr>
         <w:t xml:space="preserve"> — the on-device inference runtime this application binds to</w:t>
       </w:r>
-      <w:hyperlink w:history="1" r:id="rIdzskzhad6eujw1tabrwf5r">
+      <w:hyperlink w:history="1" r:id="rIdsbx89y3oxialm-o4fetf5">
         <w:r>
           <w:rPr>
             <w:rFonts w:ascii="Calibri" w:cs="Calibri" w:eastAsia="Calibri" w:hAnsi="Calibri"/>
@@ -9003,7 +9003,7 @@
         </w:rPr>
         <w:t xml:space="preserve"> — the neural text-to-speech voices, MIT licensed</w:t>
       </w:r>
-      <w:hyperlink w:history="1" r:id="rIdi8smtgct-sedvz1u1tni7">
+      <w:hyperlink w:history="1" r:id="rIdmb7tu7horwswlfc-8ki6b">
         <w:r>
           <w:rPr>
             <w:rFonts w:ascii="Calibri" w:cs="Calibri" w:eastAsia="Calibri" w:hAnsi="Calibri"/>
@@ -9046,7 +9046,7 @@
         </w:rPr>
         <w:t xml:space="preserve"> — voice activity detection, MIT licensed</w:t>
       </w:r>
-      <w:hyperlink w:history="1" r:id="rIdho46a2js9gzzrgmo3djvl">
+      <w:hyperlink w:history="1" r:id="rIddjjirlx_zsrrsscdloqt6">
         <w:r>
           <w:rPr>
             <w:rFonts w:ascii="Calibri" w:cs="Calibri" w:eastAsia="Calibri" w:hAnsi="Calibri"/>
@@ -9089,7 +9089,7 @@
         </w:rPr>
         <w:t xml:space="preserve"> — phonemisation data — GPL-3.0, disclosed in LICENSES.md</w:t>
       </w:r>
-      <w:hyperlink w:history="1" r:id="rIdcih2wqcwkoz30auoklkya">
+      <w:hyperlink w:history="1" r:id="rIdiwytop7rjtq6s93xmiabq">
         <w:r>
           <w:rPr>
             <w:rFonts w:ascii="Calibri" w:cs="Calibri" w:eastAsia="Calibri" w:hAnsi="Calibri"/>
@@ -9150,7 +9150,7 @@
         </w:rPr>
         <w:t xml:space="preserve"> — Definition of the Opus Audio Codec — the 6 kbps floor the compression argument is measured against</w:t>
       </w:r>
-      <w:hyperlink w:history="1" r:id="rIdrhr81j5zlcmnpmc9ul7rl">
+      <w:hyperlink w:history="1" r:id="rId9jqad_9ur7zvjxen6rdo1">
         <w:r>
           <w:rPr>
             <w:rFonts w:ascii="Calibri" w:cs="Calibri" w:eastAsia="Calibri" w:hAnsi="Calibri"/>
@@ -9193,7 +9193,7 @@
         </w:rPr>
         <w:t xml:space="preserve"> — Recommendation for Block Cipher Modes of Operation: GCM and GMAC</w:t>
       </w:r>
-      <w:hyperlink w:history="1" r:id="rIdpeeknwbr2fbyr8jtmnxe4">
+      <w:hyperlink w:history="1" r:id="rIdc_1jaigg9wdr1u2fklobw">
         <w:r>
           <w:rPr>
             <w:rFonts w:ascii="Calibri" w:cs="Calibri" w:eastAsia="Calibri" w:hAnsi="Calibri"/>
@@ -9236,7 +9236,7 @@
         </w:rPr>
         <w:t xml:space="preserve"> — LE extended advertising, on which the broadcast transport depends</w:t>
       </w:r>
-      <w:hyperlink w:history="1" r:id="rIddoxvrrkc4adfhbmmymo0h">
+      <w:hyperlink w:history="1" r:id="rIdflkrghscrbwhvzccyqpml">
         <w:r>
           <w:rPr>
             <w:rFonts w:ascii="Calibri" w:cs="Calibri" w:eastAsia="Calibri" w:hAnsi="Calibri"/>
@@ -9279,7 +9279,7 @@
         </w:rPr>
         <w:t xml:space="preserve"> — spreading factor and bitrate figures for the serial transport</w:t>
       </w:r>
-      <w:hyperlink w:history="1" r:id="rId5j3sa8rdm0gupgamme-r1">
+      <w:hyperlink w:history="1" r:id="rIdz1tuxccikzpntx0y4m3ry">
         <w:r>
           <w:rPr>
             <w:rFonts w:ascii="Calibri" w:cs="Calibri" w:eastAsia="Calibri" w:hAnsi="Calibri"/>
@@ -9340,7 +9340,7 @@
         </w:rPr>
         <w:t xml:space="preserve"> — the official portal, problem statements and submission rules</w:t>
       </w:r>
-      <w:hyperlink w:history="1" r:id="rIdsu-8pwm73cpthuznblcuw">
+      <w:hyperlink w:history="1" r:id="rIdwf4ub8woc7kfp_7cosy5d">
         <w:r>
           <w:rPr>
             <w:rFonts w:ascii="Calibri" w:cs="Calibri" w:eastAsia="Calibri" w:hAnsi="Calibri"/>
@@ -9401,7 +9401,7 @@
         </w:rPr>
         <w:t xml:space="preserve"> — the complete implementation, tests and documentation</w:t>
       </w:r>
-      <w:hyperlink w:history="1" r:id="rIdpcobdk7obpbi3yzkxjo5r">
+      <w:hyperlink w:history="1" r:id="rIdnck_yavbellymaznq4nf6">
         <w:r>
           <w:rPr>
             <w:rFonts w:ascii="Calibri" w:cs="Calibri" w:eastAsia="Calibri" w:hAnsi="Calibri"/>
@@ -9549,6 +9549,12 @@
       <w:footerReference w:type="default" r:id="rId8"/>
       <w:pgSz w:w="11906" w:h="16838" w:orient="portrait"/>
       <w:pgMar w:top="1440" w:right="1440" w:bottom="1440" w:left="1440" w:header="708" w:footer="708" w:gutter="0"/>
+      <w:pgBorders w:display="allPages" w:offsetFrom="page">
+        <w:top w:val="single" w:color="3E5463" w:sz="10" w:space="24"/>
+        <w:left w:val="single" w:color="3E5463" w:sz="10" w:space="24"/>
+        <w:bottom w:val="single" w:color="3E5463" w:sz="10" w:space="24"/>
+        <w:right w:val="single" w:color="3E5463" w:sz="10" w:space="24"/>
+      </w:pgBorders>
       <w:pgNumType/>
       <w:docGrid w:linePitch="360"/>
     </w:sectPr>

</xml_diff>